<commit_message>
Fixes #17, Fixes #20: validation, signature fix, revisit screen cleanup
</commit_message>
<xml_diff>
--- a/docassemble/CivilDocketingStatement/data/templates/civil_docketing_statement.docx
+++ b/docassemble/CivilDocketingStatement/data/templates/civil_docketing_statement.docx
@@ -1,6 +1,6 @@
 
 <file path=word/document.xml><?xml version="1.0" encoding="utf-8"?>
-<w:document xmlns:wpc="http://schemas.microsoft.com/office/word/2010/wordprocessingCanvas" xmlns:cx="http://schemas.microsoft.com/office/drawing/2014/chartex" xmlns:cx1="http://schemas.microsoft.com/office/drawing/2015/9/8/chartex" xmlns:cx2="http://schemas.microsoft.com/office/drawing/2015/10/21/chartex" xmlns:cx3="http://schemas.microsoft.com/office/drawing/2016/5/9/chartex" xmlns:cx4="http://schemas.microsoft.com/office/drawing/2016/5/10/chartex" xmlns:cx5="http://schemas.microsoft.com/office/drawing/2016/5/11/chartex" xmlns:cx6="http://schemas.microsoft.com/office/drawing/2016/5/12/chartex" xmlns:cx7="http://schemas.microsoft.com/office/drawing/2016/5/13/chartex" xmlns:cx8="http://schemas.microsoft.com/office/drawing/2016/5/14/chartex" xmlns:mc="http://schemas.openxmlformats.org/markup-compatibility/2006" xmlns:aink="http://schemas.microsoft.com/office/drawing/2016/ink" xmlns:am3d="http://schemas.microsoft.com/office/drawing/2017/model3d" xmlns:o="urn:schemas-microsoft-com:office:office" xmlns:oel="http://schemas.microsoft.com/office/2019/extlst" xmlns:r="http://schemas.openxmlformats.org/officeDocument/2006/relationships" xmlns:m="http://schemas.openxmlformats.org/officeDocument/2006/math" xmlns:v="urn:schemas-microsoft-com:vml" xmlns:wp14="http://schemas.microsoft.com/office/word/2010/wordprocessingDrawing" xmlns:wp="http://schemas.openxmlformats.org/drawingml/2006/wordprocessingDrawing" xmlns:w10="urn:schemas-microsoft-com:office:word" xmlns:w="http://schemas.openxmlformats.org/wordprocessingml/2006/main" xmlns:w14="http://schemas.microsoft.com/office/word/2010/wordml" xmlns:w15="http://schemas.microsoft.com/office/word/2012/wordml" xmlns:w16cex="http://schemas.microsoft.com/office/word/2018/wordml/cex" xmlns:w16cid="http://schemas.microsoft.com/office/word/2016/wordml/cid" xmlns:w16="http://schemas.microsoft.com/office/word/2018/wordml" xmlns:w16du="http://schemas.microsoft.com/office/word/2023/wordml/word16du" xmlns:w16sdtdh="http://schemas.microsoft.com/office/word/2020/wordml/sdtdatahash" xmlns:w16se="http://schemas.microsoft.com/office/word/2015/wordml/symex" xmlns:wpg="http://schemas.microsoft.com/office/word/2010/wordprocessingGroup" xmlns:wpi="http://schemas.microsoft.com/office/word/2010/wordprocessingInk" xmlns:wne="http://schemas.microsoft.com/office/word/2006/wordml" xmlns:wps="http://schemas.microsoft.com/office/word/2010/wordprocessingShape" mc:Ignorable="w14 w15 w16se w16cid w16 w16cex w16sdtdh w16du wp14">
+<w:document xmlns:wpc="http://schemas.microsoft.com/office/word/2010/wordprocessingCanvas" xmlns:cx="http://schemas.microsoft.com/office/drawing/2014/chartex" xmlns:cx1="http://schemas.microsoft.com/office/drawing/2015/9/8/chartex" xmlns:cx2="http://schemas.microsoft.com/office/drawing/2015/10/21/chartex" xmlns:cx3="http://schemas.microsoft.com/office/drawing/2016/5/9/chartex" xmlns:cx4="http://schemas.microsoft.com/office/drawing/2016/5/10/chartex" xmlns:cx5="http://schemas.microsoft.com/office/drawing/2016/5/11/chartex" xmlns:cx6="http://schemas.microsoft.com/office/drawing/2016/5/12/chartex" xmlns:cx7="http://schemas.microsoft.com/office/drawing/2016/5/13/chartex" xmlns:cx8="http://schemas.microsoft.com/office/drawing/2016/5/14/chartex" xmlns:mc="http://schemas.openxmlformats.org/markup-compatibility/2006" xmlns:m="http://schemas.openxmlformats.org/officeDocument/2006/math" xmlns:aink="http://schemas.microsoft.com/office/drawing/2016/ink" xmlns:am3d="http://schemas.microsoft.com/office/drawing/2017/model3d" xmlns:oel="http://schemas.microsoft.com/office/2019/extlst" xmlns:r="http://schemas.openxmlformats.org/officeDocument/2006/relationships" xmlns:wp14="http://schemas.microsoft.com/office/word/2010/wordprocessingDrawing" xmlns:wp="http://schemas.openxmlformats.org/drawingml/2006/wordprocessingDrawing" xmlns:wpg="http://schemas.microsoft.com/office/word/2010/wordprocessingGroup" xmlns:wpi="http://schemas.microsoft.com/office/word/2010/wordprocessingInk" xmlns:wps="http://schemas.microsoft.com/office/word/2010/wordprocessingShape" xmlns:o="urn:schemas-microsoft-com:office:office" xmlns:v="urn:schemas-microsoft-com:vml" xmlns:w10="urn:schemas-microsoft-com:office:word" xmlns:w="http://schemas.openxmlformats.org/wordprocessingml/2006/main" xmlns:w14="http://schemas.microsoft.com/office/word/2010/wordml" xmlns:w15="http://schemas.microsoft.com/office/word/2012/wordml" xmlns:w16cex="http://schemas.microsoft.com/office/word/2018/wordml/cex" xmlns:w16cid="http://schemas.microsoft.com/office/word/2016/wordml/cid" xmlns:w16="http://schemas.microsoft.com/office/word/2018/wordml" xmlns:w16sdtdh="http://schemas.microsoft.com/office/word/2020/wordml/sdtdatahash" xmlns:w16sdtfl="http://schemas.microsoft.com/office/word/2024/wordml/sdtformatlock" xmlns:w16se="http://schemas.microsoft.com/office/word/2015/wordml/symex" xmlns:w16du="http://schemas.microsoft.com/office/word/2023/wordml/word16du" xmlns:wne="http://schemas.microsoft.com/office/word/2006/wordml" mc:Ignorable="w14 w15 w16se w16cid w16 w16cex w16sdtdh w16sdtfl w16du wp14">
   <w:body>
     <w:p>
       <w:pPr>
@@ -1850,7 +1850,15 @@
           <w:spacing w:val="-2"/>
           <w:sz w:val="20"/>
         </w:rPr>
-        <w:t>{{ court</w:t>
+        <w:t xml:space="preserve">{{ </w:t>
+      </w:r>
+      <w:proofErr w:type="spellStart"/>
+      <w:r>
+        <w:rPr>
+          <w:spacing w:val="-2"/>
+          <w:sz w:val="20"/>
+        </w:rPr>
+        <w:t>court</w:t>
       </w:r>
       <w:proofErr w:type="gramEnd"/>
       <w:r>
@@ -1858,14 +1866,46 @@
           <w:spacing w:val="-2"/>
           <w:sz w:val="20"/>
         </w:rPr>
-        <w:t>_department }}</w:t>
-      </w:r>
-      <w:r>
-        <w:rPr>
-          <w:spacing w:val="-2"/>
-          <w:sz w:val="20"/>
-        </w:rPr>
-        <w:t xml:space="preserve"> {{ </w:t>
+        <w:t>_</w:t>
+      </w:r>
+      <w:proofErr w:type="gramStart"/>
+      <w:r>
+        <w:rPr>
+          <w:spacing w:val="-2"/>
+          <w:sz w:val="20"/>
+        </w:rPr>
+        <w:t>department</w:t>
+      </w:r>
+      <w:proofErr w:type="spellEnd"/>
+      <w:r>
+        <w:rPr>
+          <w:spacing w:val="-2"/>
+          <w:sz w:val="20"/>
+        </w:rPr>
+        <w:t xml:space="preserve"> }</w:t>
+      </w:r>
+      <w:proofErr w:type="gramEnd"/>
+      <w:r>
+        <w:rPr>
+          <w:spacing w:val="-2"/>
+          <w:sz w:val="20"/>
+        </w:rPr>
+        <w:t>}</w:t>
+      </w:r>
+      <w:r>
+        <w:rPr>
+          <w:spacing w:val="-2"/>
+          <w:sz w:val="20"/>
+        </w:rPr>
+        <w:t xml:space="preserve"> </w:t>
+      </w:r>
+      <w:proofErr w:type="gramStart"/>
+      <w:r>
+        <w:rPr>
+          <w:spacing w:val="-2"/>
+          <w:sz w:val="20"/>
+        </w:rPr>
+        <w:t xml:space="preserve">{{ </w:t>
       </w:r>
       <w:proofErr w:type="spellStart"/>
       <w:r>
@@ -1873,7 +1913,23 @@
           <w:spacing w:val="-2"/>
           <w:sz w:val="20"/>
         </w:rPr>
-        <w:t>agency_name</w:t>
+        <w:t>agency</w:t>
+      </w:r>
+      <w:proofErr w:type="gramEnd"/>
+      <w:r>
+        <w:rPr>
+          <w:spacing w:val="-2"/>
+          <w:sz w:val="20"/>
+        </w:rPr>
+        <w:t>_</w:t>
+      </w:r>
+      <w:proofErr w:type="gramStart"/>
+      <w:r>
+        <w:rPr>
+          <w:spacing w:val="-2"/>
+          <w:sz w:val="20"/>
+        </w:rPr>
+        <w:t>name</w:t>
       </w:r>
       <w:proofErr w:type="spellEnd"/>
       <w:r>
@@ -1881,7 +1937,15 @@
           <w:spacing w:val="-2"/>
           <w:sz w:val="20"/>
         </w:rPr>
-        <w:t xml:space="preserve"> }}</w:t>
+        <w:t xml:space="preserve"> }</w:t>
+      </w:r>
+      <w:proofErr w:type="gramEnd"/>
+      <w:r>
+        <w:rPr>
+          <w:spacing w:val="-2"/>
+          <w:sz w:val="20"/>
+        </w:rPr>
+        <w:t>}</w:t>
       </w:r>
     </w:p>
     <w:p>
@@ -4346,14 +4410,12 @@
         </w:rPr>
         <w:t xml:space="preserve"> </w:t>
       </w:r>
-      <w:proofErr w:type="gramStart"/>
       <w:r>
         <w:rPr>
           <w:sz w:val="20"/>
         </w:rPr>
         <w:t>therein</w:t>
       </w:r>
-      <w:proofErr w:type="gramEnd"/>
       <w:r>
         <w:rPr>
           <w:spacing w:val="-2"/>
@@ -8924,7 +8986,7 @@
         <w:ind w:left="4408" w:right="2229" w:firstLine="632"/>
         <w:jc w:val="center"/>
         <w:rPr>
-          <w:sz w:val="20"/>
+          <w:sz w:val="19"/>
         </w:rPr>
       </w:pPr>
       <w:r>
@@ -8985,7 +9047,65 @@
         <w:rPr>
           <w:sz w:val="19"/>
         </w:rPr>
-        <w:t>/s/ {{ users[0].signature }}</w:t>
+        <w:t xml:space="preserve">/s/ </w:t>
+      </w:r>
+      <w:proofErr w:type="gramStart"/>
+      <w:r>
+        <w:rPr>
+          <w:sz w:val="19"/>
+        </w:rPr>
+        <w:t>{{ users</w:t>
+      </w:r>
+      <w:proofErr w:type="gramEnd"/>
+      <w:r>
+        <w:rPr>
+          <w:sz w:val="19"/>
+        </w:rPr>
+        <w:t>[0</w:t>
+      </w:r>
+      <w:proofErr w:type="gramStart"/>
+      <w:r>
+        <w:rPr>
+          <w:sz w:val="19"/>
+        </w:rPr>
+        <w:t>].signature</w:t>
+      </w:r>
+      <w:proofErr w:type="gramEnd"/>
+      <w:r>
+        <w:rPr>
+          <w:sz w:val="19"/>
+        </w:rPr>
+        <w:t xml:space="preserve"> }}</w:t>
+      </w:r>
+    </w:p>
+    <w:p>
+      <w:pPr>
+        <w:pStyle w:val="BodyText"/>
+        <w:spacing w:before="206"/>
+        <w:ind w:left="6480" w:firstLine="720"/>
+        <w:rPr>
+          <w:sz w:val="19"/>
+        </w:rPr>
+      </w:pPr>
+      <w:r>
+        <w:rPr>
+          <w:sz w:val="19"/>
+        </w:rPr>
+        <w:t xml:space="preserve">Date: {{ </w:t>
+      </w:r>
+      <w:proofErr w:type="spellStart"/>
+      <w:r>
+        <w:rPr>
+          <w:sz w:val="19"/>
+        </w:rPr>
+        <w:t>signature_date</w:t>
+      </w:r>
+      <w:proofErr w:type="spellEnd"/>
+      <w:r>
+        <w:rPr>
+          <w:sz w:val="19"/>
+        </w:rPr>
+        <w:t xml:space="preserve"> }}</w:t>
       </w:r>
     </w:p>
     <w:p>
@@ -10997,7 +11117,7 @@
 </file>
 
 <file path=word/endnotes.xml><?xml version="1.0" encoding="utf-8"?>
-<w:endnotes xmlns:wpc="http://schemas.microsoft.com/office/word/2010/wordprocessingCanvas" xmlns:cx="http://schemas.microsoft.com/office/drawing/2014/chartex" xmlns:cx1="http://schemas.microsoft.com/office/drawing/2015/9/8/chartex" xmlns:cx2="http://schemas.microsoft.com/office/drawing/2015/10/21/chartex" xmlns:cx3="http://schemas.microsoft.com/office/drawing/2016/5/9/chartex" xmlns:cx4="http://schemas.microsoft.com/office/drawing/2016/5/10/chartex" xmlns:cx5="http://schemas.microsoft.com/office/drawing/2016/5/11/chartex" xmlns:cx6="http://schemas.microsoft.com/office/drawing/2016/5/12/chartex" xmlns:cx7="http://schemas.microsoft.com/office/drawing/2016/5/13/chartex" xmlns:cx8="http://schemas.microsoft.com/office/drawing/2016/5/14/chartex" xmlns:mc="http://schemas.openxmlformats.org/markup-compatibility/2006" xmlns:aink="http://schemas.microsoft.com/office/drawing/2016/ink" xmlns:am3d="http://schemas.microsoft.com/office/drawing/2017/model3d" xmlns:o="urn:schemas-microsoft-com:office:office" xmlns:oel="http://schemas.microsoft.com/office/2019/extlst" xmlns:r="http://schemas.openxmlformats.org/officeDocument/2006/relationships" xmlns:m="http://schemas.openxmlformats.org/officeDocument/2006/math" xmlns:v="urn:schemas-microsoft-com:vml" xmlns:wp14="http://schemas.microsoft.com/office/word/2010/wordprocessingDrawing" xmlns:wp="http://schemas.openxmlformats.org/drawingml/2006/wordprocessingDrawing" xmlns:w10="urn:schemas-microsoft-com:office:word" xmlns:w="http://schemas.openxmlformats.org/wordprocessingml/2006/main" xmlns:w14="http://schemas.microsoft.com/office/word/2010/wordml" xmlns:w15="http://schemas.microsoft.com/office/word/2012/wordml" xmlns:w16cex="http://schemas.microsoft.com/office/word/2018/wordml/cex" xmlns:w16cid="http://schemas.microsoft.com/office/word/2016/wordml/cid" xmlns:w16="http://schemas.microsoft.com/office/word/2018/wordml" xmlns:w16du="http://schemas.microsoft.com/office/word/2023/wordml/word16du" xmlns:w16sdtdh="http://schemas.microsoft.com/office/word/2020/wordml/sdtdatahash" xmlns:w16se="http://schemas.microsoft.com/office/word/2015/wordml/symex" xmlns:wpg="http://schemas.microsoft.com/office/word/2010/wordprocessingGroup" xmlns:wpi="http://schemas.microsoft.com/office/word/2010/wordprocessingInk" xmlns:wne="http://schemas.microsoft.com/office/word/2006/wordml" xmlns:wps="http://schemas.microsoft.com/office/word/2010/wordprocessingShape" mc:Ignorable="w14 w15 w16se w16cid w16 w16cex w16sdtdh w16du wp14">
+<w:endnotes xmlns:wpc="http://schemas.microsoft.com/office/word/2010/wordprocessingCanvas" xmlns:cx="http://schemas.microsoft.com/office/drawing/2014/chartex" xmlns:cx1="http://schemas.microsoft.com/office/drawing/2015/9/8/chartex" xmlns:cx2="http://schemas.microsoft.com/office/drawing/2015/10/21/chartex" xmlns:cx3="http://schemas.microsoft.com/office/drawing/2016/5/9/chartex" xmlns:cx4="http://schemas.microsoft.com/office/drawing/2016/5/10/chartex" xmlns:cx5="http://schemas.microsoft.com/office/drawing/2016/5/11/chartex" xmlns:cx6="http://schemas.microsoft.com/office/drawing/2016/5/12/chartex" xmlns:cx7="http://schemas.microsoft.com/office/drawing/2016/5/13/chartex" xmlns:cx8="http://schemas.microsoft.com/office/drawing/2016/5/14/chartex" xmlns:mc="http://schemas.openxmlformats.org/markup-compatibility/2006" xmlns:m="http://schemas.openxmlformats.org/officeDocument/2006/math" xmlns:aink="http://schemas.microsoft.com/office/drawing/2016/ink" xmlns:am3d="http://schemas.microsoft.com/office/drawing/2017/model3d" xmlns:oel="http://schemas.microsoft.com/office/2019/extlst" xmlns:r="http://schemas.openxmlformats.org/officeDocument/2006/relationships" xmlns:wp14="http://schemas.microsoft.com/office/word/2010/wordprocessingDrawing" xmlns:wp="http://schemas.openxmlformats.org/drawingml/2006/wordprocessingDrawing" xmlns:wpg="http://schemas.microsoft.com/office/word/2010/wordprocessingGroup" xmlns:wpi="http://schemas.microsoft.com/office/word/2010/wordprocessingInk" xmlns:wps="http://schemas.microsoft.com/office/word/2010/wordprocessingShape" xmlns:o="urn:schemas-microsoft-com:office:office" xmlns:v="urn:schemas-microsoft-com:vml" xmlns:w10="urn:schemas-microsoft-com:office:word" xmlns:w="http://schemas.openxmlformats.org/wordprocessingml/2006/main" xmlns:w14="http://schemas.microsoft.com/office/word/2010/wordml" xmlns:w15="http://schemas.microsoft.com/office/word/2012/wordml" xmlns:w16cex="http://schemas.microsoft.com/office/word/2018/wordml/cex" xmlns:w16cid="http://schemas.microsoft.com/office/word/2016/wordml/cid" xmlns:w16="http://schemas.microsoft.com/office/word/2018/wordml" xmlns:w16sdtdh="http://schemas.microsoft.com/office/word/2020/wordml/sdtdatahash" xmlns:w16sdtfl="http://schemas.microsoft.com/office/word/2024/wordml/sdtformatlock" xmlns:w16se="http://schemas.microsoft.com/office/word/2015/wordml/symex" xmlns:w16du="http://schemas.microsoft.com/office/word/2023/wordml/word16du" xmlns:wne="http://schemas.microsoft.com/office/word/2006/wordml" mc:Ignorable="w14 w15 w16se w16cid w16 w16cex w16sdtdh w16sdtfl w16du wp14">
   <w:endnote w:type="separator" w:id="-1">
     <w:p>
       <w:r>
@@ -11016,7 +11136,7 @@
 </file>
 
 <file path=word/footer1.xml><?xml version="1.0" encoding="utf-8"?>
-<w:ftr xmlns:wpc="http://schemas.microsoft.com/office/word/2010/wordprocessingCanvas" xmlns:cx="http://schemas.microsoft.com/office/drawing/2014/chartex" xmlns:cx1="http://schemas.microsoft.com/office/drawing/2015/9/8/chartex" xmlns:cx2="http://schemas.microsoft.com/office/drawing/2015/10/21/chartex" xmlns:cx3="http://schemas.microsoft.com/office/drawing/2016/5/9/chartex" xmlns:cx4="http://schemas.microsoft.com/office/drawing/2016/5/10/chartex" xmlns:cx5="http://schemas.microsoft.com/office/drawing/2016/5/11/chartex" xmlns:cx6="http://schemas.microsoft.com/office/drawing/2016/5/12/chartex" xmlns:cx7="http://schemas.microsoft.com/office/drawing/2016/5/13/chartex" xmlns:cx8="http://schemas.microsoft.com/office/drawing/2016/5/14/chartex" xmlns:mc="http://schemas.openxmlformats.org/markup-compatibility/2006" xmlns:aink="http://schemas.microsoft.com/office/drawing/2016/ink" xmlns:am3d="http://schemas.microsoft.com/office/drawing/2017/model3d" xmlns:o="urn:schemas-microsoft-com:office:office" xmlns:oel="http://schemas.microsoft.com/office/2019/extlst" xmlns:r="http://schemas.openxmlformats.org/officeDocument/2006/relationships" xmlns:m="http://schemas.openxmlformats.org/officeDocument/2006/math" xmlns:v="urn:schemas-microsoft-com:vml" xmlns:wp14="http://schemas.microsoft.com/office/word/2010/wordprocessingDrawing" xmlns:wp="http://schemas.openxmlformats.org/drawingml/2006/wordprocessingDrawing" xmlns:w10="urn:schemas-microsoft-com:office:word" xmlns:w="http://schemas.openxmlformats.org/wordprocessingml/2006/main" xmlns:w14="http://schemas.microsoft.com/office/word/2010/wordml" xmlns:w15="http://schemas.microsoft.com/office/word/2012/wordml" xmlns:w16cex="http://schemas.microsoft.com/office/word/2018/wordml/cex" xmlns:w16cid="http://schemas.microsoft.com/office/word/2016/wordml/cid" xmlns:w16="http://schemas.microsoft.com/office/word/2018/wordml" xmlns:w16du="http://schemas.microsoft.com/office/word/2023/wordml/word16du" xmlns:w16sdtdh="http://schemas.microsoft.com/office/word/2020/wordml/sdtdatahash" xmlns:w16se="http://schemas.microsoft.com/office/word/2015/wordml/symex" xmlns:wpg="http://schemas.microsoft.com/office/word/2010/wordprocessingGroup" xmlns:wpi="http://schemas.microsoft.com/office/word/2010/wordprocessingInk" xmlns:wne="http://schemas.microsoft.com/office/word/2006/wordml" xmlns:wps="http://schemas.microsoft.com/office/word/2010/wordprocessingShape" mc:Ignorable="w14 w15 w16se w16cid w16 w16cex w16sdtdh w16du wp14">
+<w:ftr xmlns:wpc="http://schemas.microsoft.com/office/word/2010/wordprocessingCanvas" xmlns:cx="http://schemas.microsoft.com/office/drawing/2014/chartex" xmlns:cx1="http://schemas.microsoft.com/office/drawing/2015/9/8/chartex" xmlns:cx2="http://schemas.microsoft.com/office/drawing/2015/10/21/chartex" xmlns:cx3="http://schemas.microsoft.com/office/drawing/2016/5/9/chartex" xmlns:cx4="http://schemas.microsoft.com/office/drawing/2016/5/10/chartex" xmlns:cx5="http://schemas.microsoft.com/office/drawing/2016/5/11/chartex" xmlns:cx6="http://schemas.microsoft.com/office/drawing/2016/5/12/chartex" xmlns:cx7="http://schemas.microsoft.com/office/drawing/2016/5/13/chartex" xmlns:cx8="http://schemas.microsoft.com/office/drawing/2016/5/14/chartex" xmlns:mc="http://schemas.openxmlformats.org/markup-compatibility/2006" xmlns:m="http://schemas.openxmlformats.org/officeDocument/2006/math" xmlns:aink="http://schemas.microsoft.com/office/drawing/2016/ink" xmlns:am3d="http://schemas.microsoft.com/office/drawing/2017/model3d" xmlns:oel="http://schemas.microsoft.com/office/2019/extlst" xmlns:r="http://schemas.openxmlformats.org/officeDocument/2006/relationships" xmlns:wp14="http://schemas.microsoft.com/office/word/2010/wordprocessingDrawing" xmlns:wp="http://schemas.openxmlformats.org/drawingml/2006/wordprocessingDrawing" xmlns:wpg="http://schemas.microsoft.com/office/word/2010/wordprocessingGroup" xmlns:wpi="http://schemas.microsoft.com/office/word/2010/wordprocessingInk" xmlns:wps="http://schemas.microsoft.com/office/word/2010/wordprocessingShape" xmlns:o="urn:schemas-microsoft-com:office:office" xmlns:v="urn:schemas-microsoft-com:vml" xmlns:w10="urn:schemas-microsoft-com:office:word" xmlns:w="http://schemas.openxmlformats.org/wordprocessingml/2006/main" xmlns:w14="http://schemas.microsoft.com/office/word/2010/wordml" xmlns:w15="http://schemas.microsoft.com/office/word/2012/wordml" xmlns:w16cex="http://schemas.microsoft.com/office/word/2018/wordml/cex" xmlns:w16cid="http://schemas.microsoft.com/office/word/2016/wordml/cid" xmlns:w16="http://schemas.microsoft.com/office/word/2018/wordml" xmlns:w16sdtdh="http://schemas.microsoft.com/office/word/2020/wordml/sdtdatahash" xmlns:w16sdtfl="http://schemas.microsoft.com/office/word/2024/wordml/sdtformatlock" xmlns:w16se="http://schemas.microsoft.com/office/word/2015/wordml/symex" xmlns:w16du="http://schemas.microsoft.com/office/word/2023/wordml/word16du" xmlns:wne="http://schemas.microsoft.com/office/word/2006/wordml" mc:Ignorable="w14 w15 w16se w16cid w16 w16cex w16sdtdh w16sdtfl w16du wp14">
   <w:sdt>
     <w:sdtPr>
       <w:rPr>
@@ -11067,7 +11187,7 @@
 </file>
 
 <file path=word/footer2.xml><?xml version="1.0" encoding="utf-8"?>
-<w:ftr xmlns:wpc="http://schemas.microsoft.com/office/word/2010/wordprocessingCanvas" xmlns:cx="http://schemas.microsoft.com/office/drawing/2014/chartex" xmlns:cx1="http://schemas.microsoft.com/office/drawing/2015/9/8/chartex" xmlns:cx2="http://schemas.microsoft.com/office/drawing/2015/10/21/chartex" xmlns:cx3="http://schemas.microsoft.com/office/drawing/2016/5/9/chartex" xmlns:cx4="http://schemas.microsoft.com/office/drawing/2016/5/10/chartex" xmlns:cx5="http://schemas.microsoft.com/office/drawing/2016/5/11/chartex" xmlns:cx6="http://schemas.microsoft.com/office/drawing/2016/5/12/chartex" xmlns:cx7="http://schemas.microsoft.com/office/drawing/2016/5/13/chartex" xmlns:cx8="http://schemas.microsoft.com/office/drawing/2016/5/14/chartex" xmlns:mc="http://schemas.openxmlformats.org/markup-compatibility/2006" xmlns:aink="http://schemas.microsoft.com/office/drawing/2016/ink" xmlns:am3d="http://schemas.microsoft.com/office/drawing/2017/model3d" xmlns:o="urn:schemas-microsoft-com:office:office" xmlns:oel="http://schemas.microsoft.com/office/2019/extlst" xmlns:r="http://schemas.openxmlformats.org/officeDocument/2006/relationships" xmlns:m="http://schemas.openxmlformats.org/officeDocument/2006/math" xmlns:v="urn:schemas-microsoft-com:vml" xmlns:wp14="http://schemas.microsoft.com/office/word/2010/wordprocessingDrawing" xmlns:wp="http://schemas.openxmlformats.org/drawingml/2006/wordprocessingDrawing" xmlns:w10="urn:schemas-microsoft-com:office:word" xmlns:w="http://schemas.openxmlformats.org/wordprocessingml/2006/main" xmlns:w14="http://schemas.microsoft.com/office/word/2010/wordml" xmlns:w15="http://schemas.microsoft.com/office/word/2012/wordml" xmlns:w16cex="http://schemas.microsoft.com/office/word/2018/wordml/cex" xmlns:w16cid="http://schemas.microsoft.com/office/word/2016/wordml/cid" xmlns:w16="http://schemas.microsoft.com/office/word/2018/wordml" xmlns:w16du="http://schemas.microsoft.com/office/word/2023/wordml/word16du" xmlns:w16sdtdh="http://schemas.microsoft.com/office/word/2020/wordml/sdtdatahash" xmlns:w16se="http://schemas.microsoft.com/office/word/2015/wordml/symex" xmlns:wpg="http://schemas.microsoft.com/office/word/2010/wordprocessingGroup" xmlns:wpi="http://schemas.microsoft.com/office/word/2010/wordprocessingInk" xmlns:wne="http://schemas.microsoft.com/office/word/2006/wordml" xmlns:wps="http://schemas.microsoft.com/office/word/2010/wordprocessingShape" mc:Ignorable="w14 w15 w16se w16cid w16 w16cex w16sdtdh w16du wp14">
+<w:ftr xmlns:wpc="http://schemas.microsoft.com/office/word/2010/wordprocessingCanvas" xmlns:cx="http://schemas.microsoft.com/office/drawing/2014/chartex" xmlns:cx1="http://schemas.microsoft.com/office/drawing/2015/9/8/chartex" xmlns:cx2="http://schemas.microsoft.com/office/drawing/2015/10/21/chartex" xmlns:cx3="http://schemas.microsoft.com/office/drawing/2016/5/9/chartex" xmlns:cx4="http://schemas.microsoft.com/office/drawing/2016/5/10/chartex" xmlns:cx5="http://schemas.microsoft.com/office/drawing/2016/5/11/chartex" xmlns:cx6="http://schemas.microsoft.com/office/drawing/2016/5/12/chartex" xmlns:cx7="http://schemas.microsoft.com/office/drawing/2016/5/13/chartex" xmlns:cx8="http://schemas.microsoft.com/office/drawing/2016/5/14/chartex" xmlns:mc="http://schemas.openxmlformats.org/markup-compatibility/2006" xmlns:m="http://schemas.openxmlformats.org/officeDocument/2006/math" xmlns:aink="http://schemas.microsoft.com/office/drawing/2016/ink" xmlns:am3d="http://schemas.microsoft.com/office/drawing/2017/model3d" xmlns:oel="http://schemas.microsoft.com/office/2019/extlst" xmlns:r="http://schemas.openxmlformats.org/officeDocument/2006/relationships" xmlns:wp14="http://schemas.microsoft.com/office/word/2010/wordprocessingDrawing" xmlns:wp="http://schemas.openxmlformats.org/drawingml/2006/wordprocessingDrawing" xmlns:wpg="http://schemas.microsoft.com/office/word/2010/wordprocessingGroup" xmlns:wpi="http://schemas.microsoft.com/office/word/2010/wordprocessingInk" xmlns:wps="http://schemas.microsoft.com/office/word/2010/wordprocessingShape" xmlns:o="urn:schemas-microsoft-com:office:office" xmlns:v="urn:schemas-microsoft-com:vml" xmlns:w10="urn:schemas-microsoft-com:office:word" xmlns:w="http://schemas.openxmlformats.org/wordprocessingml/2006/main" xmlns:w14="http://schemas.microsoft.com/office/word/2010/wordml" xmlns:w15="http://schemas.microsoft.com/office/word/2012/wordml" xmlns:w16cex="http://schemas.microsoft.com/office/word/2018/wordml/cex" xmlns:w16cid="http://schemas.microsoft.com/office/word/2016/wordml/cid" xmlns:w16="http://schemas.microsoft.com/office/word/2018/wordml" xmlns:w16sdtdh="http://schemas.microsoft.com/office/word/2020/wordml/sdtdatahash" xmlns:w16sdtfl="http://schemas.microsoft.com/office/word/2024/wordml/sdtformatlock" xmlns:w16se="http://schemas.microsoft.com/office/word/2015/wordml/symex" xmlns:w16du="http://schemas.microsoft.com/office/word/2023/wordml/word16du" xmlns:wne="http://schemas.microsoft.com/office/word/2006/wordml" mc:Ignorable="w14 w15 w16se w16cid w16 w16cex w16sdtdh w16sdtfl w16du wp14">
   <w:sdt>
     <w:sdtPr>
       <w:rPr>
@@ -11129,19 +11249,11 @@
         <w:rFonts w:ascii="Arial" w:hAnsi="Arial" w:cs="Arial"/>
       </w:rPr>
     </w:pPr>
-    <w:proofErr w:type="spellStart"/>
     <w:r>
       <w:rPr>
         <w:rFonts w:ascii="Arial" w:hAnsi="Arial" w:cs="Arial"/>
       </w:rPr>
-      <w:t>APC002</w:t>
-    </w:r>
-    <w:proofErr w:type="spellEnd"/>
-    <w:r>
-      <w:rPr>
-        <w:rFonts w:ascii="Arial" w:hAnsi="Arial" w:cs="Arial"/>
-      </w:rPr>
-      <w:t xml:space="preserve"> (4/1/26)</w:t>
+      <w:t>APC002 (4/1/26)</w:t>
     </w:r>
   </w:p>
   <w:p>
@@ -11153,7 +11265,7 @@
 </file>
 
 <file path=word/footnotes.xml><?xml version="1.0" encoding="utf-8"?>
-<w:footnotes xmlns:wpc="http://schemas.microsoft.com/office/word/2010/wordprocessingCanvas" xmlns:cx="http://schemas.microsoft.com/office/drawing/2014/chartex" xmlns:cx1="http://schemas.microsoft.com/office/drawing/2015/9/8/chartex" xmlns:cx2="http://schemas.microsoft.com/office/drawing/2015/10/21/chartex" xmlns:cx3="http://schemas.microsoft.com/office/drawing/2016/5/9/chartex" xmlns:cx4="http://schemas.microsoft.com/office/drawing/2016/5/10/chartex" xmlns:cx5="http://schemas.microsoft.com/office/drawing/2016/5/11/chartex" xmlns:cx6="http://schemas.microsoft.com/office/drawing/2016/5/12/chartex" xmlns:cx7="http://schemas.microsoft.com/office/drawing/2016/5/13/chartex" xmlns:cx8="http://schemas.microsoft.com/office/drawing/2016/5/14/chartex" xmlns:mc="http://schemas.openxmlformats.org/markup-compatibility/2006" xmlns:aink="http://schemas.microsoft.com/office/drawing/2016/ink" xmlns:am3d="http://schemas.microsoft.com/office/drawing/2017/model3d" xmlns:o="urn:schemas-microsoft-com:office:office" xmlns:oel="http://schemas.microsoft.com/office/2019/extlst" xmlns:r="http://schemas.openxmlformats.org/officeDocument/2006/relationships" xmlns:m="http://schemas.openxmlformats.org/officeDocument/2006/math" xmlns:v="urn:schemas-microsoft-com:vml" xmlns:wp14="http://schemas.microsoft.com/office/word/2010/wordprocessingDrawing" xmlns:wp="http://schemas.openxmlformats.org/drawingml/2006/wordprocessingDrawing" xmlns:w10="urn:schemas-microsoft-com:office:word" xmlns:w="http://schemas.openxmlformats.org/wordprocessingml/2006/main" xmlns:w14="http://schemas.microsoft.com/office/word/2010/wordml" xmlns:w15="http://schemas.microsoft.com/office/word/2012/wordml" xmlns:w16cex="http://schemas.microsoft.com/office/word/2018/wordml/cex" xmlns:w16cid="http://schemas.microsoft.com/office/word/2016/wordml/cid" xmlns:w16="http://schemas.microsoft.com/office/word/2018/wordml" xmlns:w16du="http://schemas.microsoft.com/office/word/2023/wordml/word16du" xmlns:w16sdtdh="http://schemas.microsoft.com/office/word/2020/wordml/sdtdatahash" xmlns:w16se="http://schemas.microsoft.com/office/word/2015/wordml/symex" xmlns:wpg="http://schemas.microsoft.com/office/word/2010/wordprocessingGroup" xmlns:wpi="http://schemas.microsoft.com/office/word/2010/wordprocessingInk" xmlns:wne="http://schemas.microsoft.com/office/word/2006/wordml" xmlns:wps="http://schemas.microsoft.com/office/word/2010/wordprocessingShape" mc:Ignorable="w14 w15 w16se w16cid w16 w16cex w16sdtdh w16du wp14">
+<w:footnotes xmlns:wpc="http://schemas.microsoft.com/office/word/2010/wordprocessingCanvas" xmlns:cx="http://schemas.microsoft.com/office/drawing/2014/chartex" xmlns:cx1="http://schemas.microsoft.com/office/drawing/2015/9/8/chartex" xmlns:cx2="http://schemas.microsoft.com/office/drawing/2015/10/21/chartex" xmlns:cx3="http://schemas.microsoft.com/office/drawing/2016/5/9/chartex" xmlns:cx4="http://schemas.microsoft.com/office/drawing/2016/5/10/chartex" xmlns:cx5="http://schemas.microsoft.com/office/drawing/2016/5/11/chartex" xmlns:cx6="http://schemas.microsoft.com/office/drawing/2016/5/12/chartex" xmlns:cx7="http://schemas.microsoft.com/office/drawing/2016/5/13/chartex" xmlns:cx8="http://schemas.microsoft.com/office/drawing/2016/5/14/chartex" xmlns:mc="http://schemas.openxmlformats.org/markup-compatibility/2006" xmlns:m="http://schemas.openxmlformats.org/officeDocument/2006/math" xmlns:aink="http://schemas.microsoft.com/office/drawing/2016/ink" xmlns:am3d="http://schemas.microsoft.com/office/drawing/2017/model3d" xmlns:oel="http://schemas.microsoft.com/office/2019/extlst" xmlns:r="http://schemas.openxmlformats.org/officeDocument/2006/relationships" xmlns:wp14="http://schemas.microsoft.com/office/word/2010/wordprocessingDrawing" xmlns:wp="http://schemas.openxmlformats.org/drawingml/2006/wordprocessingDrawing" xmlns:wpg="http://schemas.microsoft.com/office/word/2010/wordprocessingGroup" xmlns:wpi="http://schemas.microsoft.com/office/word/2010/wordprocessingInk" xmlns:wps="http://schemas.microsoft.com/office/word/2010/wordprocessingShape" xmlns:o="urn:schemas-microsoft-com:office:office" xmlns:v="urn:schemas-microsoft-com:vml" xmlns:w10="urn:schemas-microsoft-com:office:word" xmlns:w="http://schemas.openxmlformats.org/wordprocessingml/2006/main" xmlns:w14="http://schemas.microsoft.com/office/word/2010/wordml" xmlns:w15="http://schemas.microsoft.com/office/word/2012/wordml" xmlns:w16cex="http://schemas.microsoft.com/office/word/2018/wordml/cex" xmlns:w16cid="http://schemas.microsoft.com/office/word/2016/wordml/cid" xmlns:w16="http://schemas.microsoft.com/office/word/2018/wordml" xmlns:w16sdtdh="http://schemas.microsoft.com/office/word/2020/wordml/sdtdatahash" xmlns:w16sdtfl="http://schemas.microsoft.com/office/word/2024/wordml/sdtformatlock" xmlns:w16se="http://schemas.microsoft.com/office/word/2015/wordml/symex" xmlns:w16du="http://schemas.microsoft.com/office/word/2023/wordml/word16du" xmlns:wne="http://schemas.microsoft.com/office/word/2006/wordml" mc:Ignorable="w14 w15 w16se w16cid w16 w16cex w16sdtdh w16sdtfl w16du wp14">
   <w:footnote w:type="separator" w:id="-1">
     <w:p>
       <w:r>
@@ -11172,7 +11284,7 @@
 </file>
 
 <file path=word/numbering.xml><?xml version="1.0" encoding="utf-8"?>
-<w:numbering xmlns:wpc="http://schemas.microsoft.com/office/word/2010/wordprocessingCanvas" xmlns:cx="http://schemas.microsoft.com/office/drawing/2014/chartex" xmlns:cx1="http://schemas.microsoft.com/office/drawing/2015/9/8/chartex" xmlns:cx2="http://schemas.microsoft.com/office/drawing/2015/10/21/chartex" xmlns:cx3="http://schemas.microsoft.com/office/drawing/2016/5/9/chartex" xmlns:cx4="http://schemas.microsoft.com/office/drawing/2016/5/10/chartex" xmlns:cx5="http://schemas.microsoft.com/office/drawing/2016/5/11/chartex" xmlns:cx6="http://schemas.microsoft.com/office/drawing/2016/5/12/chartex" xmlns:cx7="http://schemas.microsoft.com/office/drawing/2016/5/13/chartex" xmlns:cx8="http://schemas.microsoft.com/office/drawing/2016/5/14/chartex" xmlns:mc="http://schemas.openxmlformats.org/markup-compatibility/2006" xmlns:aink="http://schemas.microsoft.com/office/drawing/2016/ink" xmlns:am3d="http://schemas.microsoft.com/office/drawing/2017/model3d" xmlns:o="urn:schemas-microsoft-com:office:office" xmlns:oel="http://schemas.microsoft.com/office/2019/extlst" xmlns:r="http://schemas.openxmlformats.org/officeDocument/2006/relationships" xmlns:m="http://schemas.openxmlformats.org/officeDocument/2006/math" xmlns:v="urn:schemas-microsoft-com:vml" xmlns:wp14="http://schemas.microsoft.com/office/word/2010/wordprocessingDrawing" xmlns:wp="http://schemas.openxmlformats.org/drawingml/2006/wordprocessingDrawing" xmlns:w10="urn:schemas-microsoft-com:office:word" xmlns:w="http://schemas.openxmlformats.org/wordprocessingml/2006/main" xmlns:w14="http://schemas.microsoft.com/office/word/2010/wordml" xmlns:w15="http://schemas.microsoft.com/office/word/2012/wordml" xmlns:w16cex="http://schemas.microsoft.com/office/word/2018/wordml/cex" xmlns:w16cid="http://schemas.microsoft.com/office/word/2016/wordml/cid" xmlns:w16="http://schemas.microsoft.com/office/word/2018/wordml" xmlns:w16du="http://schemas.microsoft.com/office/word/2023/wordml/word16du" xmlns:w16sdtdh="http://schemas.microsoft.com/office/word/2020/wordml/sdtdatahash" xmlns:w16se="http://schemas.microsoft.com/office/word/2015/wordml/symex" xmlns:wpg="http://schemas.microsoft.com/office/word/2010/wordprocessingGroup" xmlns:wpi="http://schemas.microsoft.com/office/word/2010/wordprocessingInk" xmlns:wne="http://schemas.microsoft.com/office/word/2006/wordml" xmlns:wps="http://schemas.microsoft.com/office/word/2010/wordprocessingShape" mc:Ignorable="w14 w15 w16se w16cid w16 w16cex w16sdtdh w16du wp14">
+<w:numbering xmlns:wpc="http://schemas.microsoft.com/office/word/2010/wordprocessingCanvas" xmlns:cx="http://schemas.microsoft.com/office/drawing/2014/chartex" xmlns:cx1="http://schemas.microsoft.com/office/drawing/2015/9/8/chartex" xmlns:cx2="http://schemas.microsoft.com/office/drawing/2015/10/21/chartex" xmlns:cx3="http://schemas.microsoft.com/office/drawing/2016/5/9/chartex" xmlns:cx4="http://schemas.microsoft.com/office/drawing/2016/5/10/chartex" xmlns:cx5="http://schemas.microsoft.com/office/drawing/2016/5/11/chartex" xmlns:cx6="http://schemas.microsoft.com/office/drawing/2016/5/12/chartex" xmlns:cx7="http://schemas.microsoft.com/office/drawing/2016/5/13/chartex" xmlns:cx8="http://schemas.microsoft.com/office/drawing/2016/5/14/chartex" xmlns:mc="http://schemas.openxmlformats.org/markup-compatibility/2006" xmlns:m="http://schemas.openxmlformats.org/officeDocument/2006/math" xmlns:aink="http://schemas.microsoft.com/office/drawing/2016/ink" xmlns:am3d="http://schemas.microsoft.com/office/drawing/2017/model3d" xmlns:oel="http://schemas.microsoft.com/office/2019/extlst" xmlns:r="http://schemas.openxmlformats.org/officeDocument/2006/relationships" xmlns:wp14="http://schemas.microsoft.com/office/word/2010/wordprocessingDrawing" xmlns:wp="http://schemas.openxmlformats.org/drawingml/2006/wordprocessingDrawing" xmlns:wpg="http://schemas.microsoft.com/office/word/2010/wordprocessingGroup" xmlns:wpi="http://schemas.microsoft.com/office/word/2010/wordprocessingInk" xmlns:wps="http://schemas.microsoft.com/office/word/2010/wordprocessingShape" xmlns:o="urn:schemas-microsoft-com:office:office" xmlns:v="urn:schemas-microsoft-com:vml" xmlns:w10="urn:schemas-microsoft-com:office:word" xmlns:w="http://schemas.openxmlformats.org/wordprocessingml/2006/main" xmlns:w14="http://schemas.microsoft.com/office/word/2010/wordml" xmlns:w15="http://schemas.microsoft.com/office/word/2012/wordml" xmlns:w16cex="http://schemas.microsoft.com/office/word/2018/wordml/cex" xmlns:w16cid="http://schemas.microsoft.com/office/word/2016/wordml/cid" xmlns:w16="http://schemas.microsoft.com/office/word/2018/wordml" xmlns:w16sdtdh="http://schemas.microsoft.com/office/word/2020/wordml/sdtdatahash" xmlns:w16sdtfl="http://schemas.microsoft.com/office/word/2024/wordml/sdtformatlock" xmlns:w16se="http://schemas.microsoft.com/office/word/2015/wordml/symex" xmlns:w16du="http://schemas.microsoft.com/office/word/2023/wordml/word16du" xmlns:wne="http://schemas.microsoft.com/office/word/2006/wordml" mc:Ignorable="w14 w15 w16se w16cid w16 w16cex w16sdtdh w16sdtfl w16du wp14">
   <w:abstractNum w:abstractNumId="0" w15:restartNumberingAfterBreak="0">
     <w:nsid w:val="757E42CF"/>
     <w:multiLevelType w:val="hybridMultilevel"/>
@@ -11307,7 +11419,7 @@
 </file>
 
 <file path=word/styles.xml><?xml version="1.0" encoding="utf-8"?>
-<w:styles xmlns:mc="http://schemas.openxmlformats.org/markup-compatibility/2006" xmlns:r="http://schemas.openxmlformats.org/officeDocument/2006/relationships" xmlns:w="http://schemas.openxmlformats.org/wordprocessingml/2006/main" xmlns:w14="http://schemas.microsoft.com/office/word/2010/wordml" xmlns:w15="http://schemas.microsoft.com/office/word/2012/wordml" xmlns:w16cex="http://schemas.microsoft.com/office/word/2018/wordml/cex" xmlns:w16cid="http://schemas.microsoft.com/office/word/2016/wordml/cid" xmlns:w16="http://schemas.microsoft.com/office/word/2018/wordml" xmlns:w16du="http://schemas.microsoft.com/office/word/2023/wordml/word16du" xmlns:w16sdtdh="http://schemas.microsoft.com/office/word/2020/wordml/sdtdatahash" xmlns:w16se="http://schemas.microsoft.com/office/word/2015/wordml/symex" mc:Ignorable="w14 w15 w16se w16cid w16 w16cex w16sdtdh w16du">
+<w:styles xmlns:mc="http://schemas.openxmlformats.org/markup-compatibility/2006" xmlns:r="http://schemas.openxmlformats.org/officeDocument/2006/relationships" xmlns:w="http://schemas.openxmlformats.org/wordprocessingml/2006/main" xmlns:w14="http://schemas.microsoft.com/office/word/2010/wordml" xmlns:w15="http://schemas.microsoft.com/office/word/2012/wordml" xmlns:w16cex="http://schemas.microsoft.com/office/word/2018/wordml/cex" xmlns:w16cid="http://schemas.microsoft.com/office/word/2016/wordml/cid" xmlns:w16="http://schemas.microsoft.com/office/word/2018/wordml" xmlns:w16sdtdh="http://schemas.microsoft.com/office/word/2020/wordml/sdtdatahash" xmlns:w16sdtfl="http://schemas.microsoft.com/office/word/2024/wordml/sdtformatlock" xmlns:w16se="http://schemas.microsoft.com/office/word/2015/wordml/symex" xmlns:w16du="http://schemas.microsoft.com/office/word/2023/wordml/word16du" mc:Ignorable="w14 w15 w16se w16cid w16 w16cex w16sdtdh w16sdtfl w16du">
   <w:docDefaults>
     <w:rPrDefault>
       <w:rPr>

</xml_diff>